<commit_message>
Add dark mode, code-copy & contact UI
Introduce a persistent dark theme with CSS variables and a theme-toggle button, plus updated styles (shadows, tag layout, responsive contact buttons). Add invite-code UI enhancements: code-row, copy buttons with Clipboard API and fallback, and a WeChat copy/contact button with feedback. Improve PDF download flow (forceDownload) and minor UX tweaks (button states, hover effects). Add a new ZA Bank markdown guide and update related docx/pdf assets.
</commit_message>
<xml_diff>
--- a/盈立复星众安平安开户指南.docx
+++ b/盈立复星众安平安开户指南.docx
@@ -5,9 +5,10 @@
     <w:p>
       <w:pPr>
         <w:rPr>
-          <w:rFonts w:ascii="宋体" w:hAnsi="宋体" w:eastAsia="宋体" w:cs="宋体"/>
+          <w:rFonts w:hint="default" w:ascii="宋体" w:hAnsi="宋体" w:eastAsia="宋体" w:cs="宋体"/>
           <w:sz w:val="24"/>
           <w:szCs w:val="24"/>
+          <w:lang w:val="en-US" w:eastAsia="zh-CN"/>
         </w:rPr>
       </w:pPr>
       <w:r>
@@ -50,6 +51,15 @@
           <w:szCs w:val="24"/>
         </w:rPr>
         <w:fldChar w:fldCharType="end"/>
+      </w:r>
+      <w:r>
+        <w:rPr>
+          <w:rFonts w:hint="eastAsia" w:ascii="宋体" w:hAnsi="宋体" w:eastAsia="宋体" w:cs="宋体"/>
+          <w:sz w:val="24"/>
+          <w:szCs w:val="24"/>
+          <w:lang w:val="en-US" w:eastAsia="zh-CN"/>
+        </w:rPr>
+        <w:t xml:space="preserve"> 开户指南在本文档第5页</w:t>
       </w:r>
     </w:p>
     <w:p>
@@ -750,7 +760,7 @@
           <w:szCs w:val="24"/>
           <w:lang w:val="en-US" w:eastAsia="zh-CN"/>
         </w:rPr>
-        <w:instrText xml:space="preserve"> HYPERLINK "https://l.za.group/FuEIv" </w:instrText>
+        <w:instrText xml:space="preserve"> HYPERLINK "https://l.za.group/qFE47" </w:instrText>
       </w:r>
       <w:r>
         <w:rPr>
@@ -769,7 +779,7 @@
           <w:szCs w:val="24"/>
           <w:lang w:val="en-US" w:eastAsia="zh-CN"/>
         </w:rPr>
-        <w:t>https://l.za.group/FuEIv</w:t>
+        <w:t>https://l.za.group/qFE47</w:t>
       </w:r>
       <w:r>
         <w:rPr>
@@ -1058,6 +1068,100 @@
     <w:p>
       <w:pPr>
         <w:rPr>
+          <w:rFonts w:hint="eastAsia"/>
+          <w:sz w:val="48"/>
+          <w:szCs w:val="48"/>
+          <w:lang w:val="en-US" w:eastAsia="zh-CN"/>
+        </w:rPr>
+      </w:pPr>
+      <w:r>
+        <w:rPr>
+          <w:rFonts w:hint="eastAsia"/>
+          <w:sz w:val="48"/>
+          <w:szCs w:val="48"/>
+          <w:lang w:val="en-US" w:eastAsia="zh-CN"/>
+        </w:rPr>
+        <w:t xml:space="preserve">我的联系方式 </w:t>
+      </w:r>
+    </w:p>
+    <w:p>
+      <w:pPr>
+        <w:rPr>
+          <w:rFonts w:hint="eastAsia"/>
+          <w:sz w:val="48"/>
+          <w:szCs w:val="48"/>
+          <w:lang w:val="en-US" w:eastAsia="zh-CN"/>
+        </w:rPr>
+      </w:pPr>
+      <w:r>
+        <w:rPr>
+          <w:rFonts w:hint="eastAsia"/>
+          <w:sz w:val="48"/>
+          <w:szCs w:val="48"/>
+          <w:lang w:val="en-US" w:eastAsia="zh-CN"/>
+        </w:rPr>
+        <w:t>TG：</w:t>
+      </w:r>
+      <w:r>
+        <w:rPr>
+          <w:rFonts w:hint="eastAsia"/>
+          <w:sz w:val="48"/>
+          <w:szCs w:val="48"/>
+          <w:lang w:val="en-US" w:eastAsia="zh-CN"/>
+        </w:rPr>
+        <w:fldChar w:fldCharType="begin"/>
+      </w:r>
+      <w:r>
+        <w:rPr>
+          <w:rFonts w:hint="eastAsia"/>
+          <w:sz w:val="48"/>
+          <w:szCs w:val="48"/>
+          <w:lang w:val="en-US" w:eastAsia="zh-CN"/>
+        </w:rPr>
+        <w:instrText xml:space="preserve"> HYPERLINK "https://t.me/KirinChew" </w:instrText>
+      </w:r>
+      <w:r>
+        <w:rPr>
+          <w:rFonts w:hint="eastAsia"/>
+          <w:sz w:val="48"/>
+          <w:szCs w:val="48"/>
+          <w:lang w:val="en-US" w:eastAsia="zh-CN"/>
+        </w:rPr>
+        <w:fldChar w:fldCharType="separate"/>
+      </w:r>
+      <w:r>
+        <w:rPr>
+          <w:rStyle w:val="10"/>
+          <w:rFonts w:hint="eastAsia"/>
+          <w:sz w:val="48"/>
+          <w:szCs w:val="48"/>
+          <w:lang w:val="en-US" w:eastAsia="zh-CN"/>
+        </w:rPr>
+        <w:t>https://t.me/KirinChew</w:t>
+      </w:r>
+      <w:r>
+        <w:rPr>
+          <w:rFonts w:hint="eastAsia"/>
+          <w:sz w:val="48"/>
+          <w:szCs w:val="48"/>
+          <w:lang w:val="en-US" w:eastAsia="zh-CN"/>
+        </w:rPr>
+        <w:fldChar w:fldCharType="end"/>
+      </w:r>
+    </w:p>
+    <w:p>
+      <w:pPr>
+        <w:rPr>
+          <w:rFonts w:hint="eastAsia"/>
+          <w:sz w:val="48"/>
+          <w:szCs w:val="48"/>
+          <w:lang w:val="en-US" w:eastAsia="zh-CN"/>
+        </w:rPr>
+      </w:pPr>
+    </w:p>
+    <w:p>
+      <w:pPr>
+        <w:rPr>
           <w:rFonts w:hint="default"/>
           <w:sz w:val="48"/>
           <w:szCs w:val="48"/>
@@ -1071,53 +1175,7 @@
           <w:szCs w:val="48"/>
           <w:lang w:val="en-US" w:eastAsia="zh-CN"/>
         </w:rPr>
-        <w:t xml:space="preserve">我的联系方式 </w:t>
-      </w:r>
-      <w:r>
-        <w:rPr>
-          <w:rFonts w:hint="eastAsia"/>
-          <w:sz w:val="48"/>
-          <w:szCs w:val="48"/>
-          <w:lang w:val="en-US" w:eastAsia="zh-CN"/>
-        </w:rPr>
-        <w:fldChar w:fldCharType="begin"/>
-      </w:r>
-      <w:r>
-        <w:rPr>
-          <w:rFonts w:hint="eastAsia"/>
-          <w:sz w:val="48"/>
-          <w:szCs w:val="48"/>
-          <w:lang w:val="en-US" w:eastAsia="zh-CN"/>
-        </w:rPr>
-        <w:instrText xml:space="preserve"> HYPERLINK "https://t.me/KirinChew" </w:instrText>
-      </w:r>
-      <w:r>
-        <w:rPr>
-          <w:rFonts w:hint="eastAsia"/>
-          <w:sz w:val="48"/>
-          <w:szCs w:val="48"/>
-          <w:lang w:val="en-US" w:eastAsia="zh-CN"/>
-        </w:rPr>
-        <w:fldChar w:fldCharType="separate"/>
-      </w:r>
-      <w:r>
-        <w:rPr>
-          <w:rStyle w:val="10"/>
-          <w:rFonts w:hint="eastAsia"/>
-          <w:sz w:val="48"/>
-          <w:szCs w:val="48"/>
-          <w:lang w:val="en-US" w:eastAsia="zh-CN"/>
-        </w:rPr>
-        <w:t>https://t.me/KirinChew</w:t>
-      </w:r>
-      <w:r>
-        <w:rPr>
-          <w:rFonts w:hint="eastAsia"/>
-          <w:sz w:val="48"/>
-          <w:szCs w:val="48"/>
-          <w:lang w:val="en-US" w:eastAsia="zh-CN"/>
-        </w:rPr>
-        <w:fldChar w:fldCharType="end"/>
+        <w:t>微信：KirinZhou711</w:t>
       </w:r>
     </w:p>
     <w:p>
@@ -1133,7 +1191,7 @@
     <w:p>
       <w:pPr>
         <w:rPr>
-          <w:rFonts w:hint="eastAsia"/>
+          <w:rFonts w:hint="default"/>
           <w:sz w:val="18"/>
           <w:szCs w:val="18"/>
           <w:lang w:val="en-US" w:eastAsia="zh-CN"/>
@@ -1146,18 +1204,8 @@
           <w:szCs w:val="24"/>
           <w:lang w:val="en-US" w:eastAsia="zh-CN"/>
         </w:rPr>
-        <w:t>另外，需要香港电话卡的可以联系我（CSL和hahasim）</w:t>
-      </w:r>
-    </w:p>
-    <w:p>
-      <w:pPr>
-        <w:rPr>
-          <w:rFonts w:hint="eastAsia"/>
-          <w:sz w:val="18"/>
-          <w:szCs w:val="18"/>
-          <w:lang w:val="en-US" w:eastAsia="zh-CN"/>
-        </w:rPr>
-      </w:pPr>
+        <w:t>需要香港电话卡接短信/用流量的也可以联系我（CSL和hahasim）保号年付6HKD</w:t>
+      </w:r>
     </w:p>
     <w:p>
       <w:pPr>
@@ -1220,20 +1268,41 @@
     <w:p>
       <w:pPr>
         <w:rPr>
-          <w:rFonts w:hint="eastAsia"/>
-          <w:sz w:val="48"/>
-          <w:szCs w:val="48"/>
-          <w:lang w:val="en-US" w:eastAsia="zh-CN"/>
-        </w:rPr>
-      </w:pPr>
-      <w:r>
-        <w:rPr>
-          <w:rFonts w:hint="eastAsia"/>
-          <w:sz w:val="48"/>
-          <w:szCs w:val="48"/>
-          <w:lang w:val="en-US" w:eastAsia="zh-CN"/>
-        </w:rPr>
-        <w:t>以上软件均可以在谷歌商店下载，建议去之前先下载好</w:t>
+          <w:rFonts w:hint="default"/>
+          <w:sz w:val="48"/>
+          <w:szCs w:val="48"/>
+          <w:lang w:val="en-US" w:eastAsia="zh-CN"/>
+        </w:rPr>
+      </w:pPr>
+      <w:r>
+        <w:rPr>
+          <w:rFonts w:hint="eastAsia"/>
+          <w:sz w:val="48"/>
+          <w:szCs w:val="48"/>
+          <w:lang w:val="en-US" w:eastAsia="zh-CN"/>
+        </w:rPr>
+        <w:t>以上软件均可以在谷歌商店或对应官网</w:t>
+      </w:r>
+      <w:bookmarkStart w:id="0" w:name="_GoBack"/>
+      <w:bookmarkEnd w:id="0"/>
+      <w:r>
+        <w:rPr>
+          <w:rFonts w:hint="eastAsia"/>
+          <w:sz w:val="48"/>
+          <w:szCs w:val="48"/>
+          <w:lang w:val="en-US" w:eastAsia="zh-CN"/>
+        </w:rPr>
+        <w:t>下载，建议去之前先下载好。</w:t>
+      </w:r>
+      <w:r>
+        <w:rPr>
+          <w:rFonts w:hint="eastAsia"/>
+          <w:sz w:val="48"/>
+          <w:szCs w:val="48"/>
+          <w:highlight w:val="yellow"/>
+          <w:lang w:val="en-US" w:eastAsia="zh-CN"/>
+        </w:rPr>
+        <w:t>所有证件有效期均需要大于一年！</w:t>
       </w:r>
     </w:p>
     <w:p>
@@ -1387,29 +1456,90 @@
         <w:ind w:left="0" w:firstLine="0"/>
         <w:jc w:val="left"/>
         <w:rPr>
-          <w:rFonts w:hint="default" w:ascii="Segoe UI" w:hAnsi="Segoe UI" w:eastAsia="Segoe UI" w:cs="Segoe UI"/>
-          <w:i w:val="0"/>
-          <w:iCs w:val="0"/>
-          <w:caps w:val="0"/>
-          <w:color w:val="000000"/>
-          <w:spacing w:val="0"/>
-          <w:sz w:val="21"/>
-          <w:szCs w:val="21"/>
-        </w:rPr>
-      </w:pPr>
-      <w:r>
-        <w:rPr>
-          <w:rFonts w:hint="default" w:ascii="Segoe UI" w:hAnsi="Segoe UI" w:eastAsia="Segoe UI" w:cs="Segoe UI"/>
-          <w:i w:val="0"/>
-          <w:iCs w:val="0"/>
-          <w:caps w:val="0"/>
-          <w:color w:val="000000"/>
-          <w:spacing w:val="0"/>
-          <w:sz w:val="21"/>
-          <w:szCs w:val="21"/>
-          <w:shd w:val="clear" w:fill="FFFFFF"/>
-        </w:rPr>
-        <w:t>需在香港境内,准备内地身份证、本人实名银行卡</w:t>
+          <w:rFonts w:hint="default" w:ascii="Segoe UI" w:hAnsi="Segoe UI" w:eastAsia="宋体" w:cs="Segoe UI"/>
+          <w:i w:val="0"/>
+          <w:iCs w:val="0"/>
+          <w:caps w:val="0"/>
+          <w:color w:val="000000"/>
+          <w:spacing w:val="0"/>
+          <w:sz w:val="21"/>
+          <w:szCs w:val="21"/>
+          <w:shd w:val="clear" w:fill="FFFFFF"/>
+          <w:lang w:val="en-US" w:eastAsia="zh-CN"/>
+        </w:rPr>
+      </w:pPr>
+      <w:r>
+        <w:rPr>
+          <w:rFonts w:hint="default" w:ascii="Segoe UI" w:hAnsi="Segoe UI" w:eastAsia="Segoe UI" w:cs="Segoe UI"/>
+          <w:i w:val="0"/>
+          <w:iCs w:val="0"/>
+          <w:caps w:val="0"/>
+          <w:color w:val="000000"/>
+          <w:spacing w:val="0"/>
+          <w:sz w:val="21"/>
+          <w:szCs w:val="21"/>
+          <w:shd w:val="clear" w:fill="FFFFFF"/>
+        </w:rPr>
+        <w:t>需在香港境内,准备内地身份证、本人实名</w:t>
+      </w:r>
+      <w:r>
+        <w:rPr>
+          <w:rFonts w:hint="eastAsia" w:ascii="Segoe UI" w:hAnsi="Segoe UI" w:eastAsia="宋体" w:cs="Segoe UI"/>
+          <w:i w:val="0"/>
+          <w:iCs w:val="0"/>
+          <w:caps w:val="0"/>
+          <w:color w:val="000000"/>
+          <w:spacing w:val="0"/>
+          <w:sz w:val="21"/>
+          <w:szCs w:val="21"/>
+          <w:shd w:val="clear" w:fill="FFFFFF"/>
+          <w:lang w:val="en-US" w:eastAsia="zh-CN"/>
+        </w:rPr>
+        <w:t>的内地</w:t>
+      </w:r>
+      <w:r>
+        <w:rPr>
+          <w:rFonts w:hint="default" w:ascii="Segoe UI" w:hAnsi="Segoe UI" w:eastAsia="Segoe UI" w:cs="Segoe UI"/>
+          <w:i w:val="0"/>
+          <w:iCs w:val="0"/>
+          <w:caps w:val="0"/>
+          <w:color w:val="000000"/>
+          <w:spacing w:val="0"/>
+          <w:sz w:val="21"/>
+          <w:szCs w:val="21"/>
+          <w:shd w:val="clear" w:fill="FFFFFF"/>
+        </w:rPr>
+        <w:t>银行卡</w:t>
+      </w:r>
+      <w:r>
+        <w:rPr>
+          <w:rFonts w:hint="eastAsia" w:ascii="Segoe UI" w:hAnsi="Segoe UI" w:eastAsia="宋体" w:cs="Segoe UI"/>
+          <w:i w:val="0"/>
+          <w:iCs w:val="0"/>
+          <w:caps w:val="0"/>
+          <w:color w:val="000000"/>
+          <w:spacing w:val="0"/>
+          <w:sz w:val="21"/>
+          <w:szCs w:val="21"/>
+          <w:shd w:val="clear" w:fill="FFFFFF"/>
+          <w:lang w:eastAsia="zh-CN"/>
+        </w:rPr>
+        <w:t>、</w:t>
+      </w:r>
+      <w:r>
+        <w:rPr>
+          <w:rFonts w:hint="eastAsia" w:ascii="Segoe UI" w:hAnsi="Segoe UI" w:eastAsia="宋体" w:cs="Segoe UI"/>
+          <w:i w:val="0"/>
+          <w:iCs w:val="0"/>
+          <w:caps w:val="0"/>
+          <w:color w:val="000000"/>
+          <w:spacing w:val="0"/>
+          <w:sz w:val="21"/>
+          <w:szCs w:val="21"/>
+          <w:shd w:val="clear" w:fill="FFFFFF"/>
+          <w:lang w:val="en-US" w:eastAsia="zh-CN"/>
+        </w:rPr>
+        <w:t>港澳通行证（如有需要）</w:t>
       </w:r>
     </w:p>
     <w:p>
@@ -1423,31 +1553,18 @@
         <w:ind w:left="0" w:firstLine="0"/>
         <w:jc w:val="left"/>
         <w:rPr>
-          <w:rFonts w:hint="default" w:ascii="Segoe UI" w:hAnsi="Segoe UI" w:eastAsia="Segoe UI" w:cs="Segoe UI"/>
-          <w:i w:val="0"/>
-          <w:iCs w:val="0"/>
-          <w:caps w:val="0"/>
-          <w:color w:val="000000"/>
-          <w:spacing w:val="0"/>
-          <w:sz w:val="21"/>
-          <w:szCs w:val="21"/>
-          <w:shd w:val="clear" w:fill="FFFFFF"/>
-        </w:rPr>
-      </w:pPr>
-      <w:r>
-        <w:rPr>
-          <w:rFonts w:hint="default" w:ascii="Segoe UI" w:hAnsi="Segoe UI" w:eastAsia="Segoe UI" w:cs="Segoe UI"/>
-          <w:i w:val="0"/>
-          <w:iCs w:val="0"/>
-          <w:caps w:val="0"/>
-          <w:color w:val="000000"/>
-          <w:spacing w:val="0"/>
-          <w:sz w:val="21"/>
-          <w:szCs w:val="21"/>
-          <w:shd w:val="clear" w:fill="FFFFFF"/>
-        </w:rPr>
-        <w:t>手机</w:t>
-      </w:r>
+          <w:rFonts w:hint="default" w:ascii="Segoe UI" w:hAnsi="Segoe UI" w:eastAsia="宋体" w:cs="Segoe UI"/>
+          <w:i w:val="0"/>
+          <w:iCs w:val="0"/>
+          <w:caps w:val="0"/>
+          <w:color w:val="000000"/>
+          <w:spacing w:val="0"/>
+          <w:sz w:val="21"/>
+          <w:szCs w:val="21"/>
+          <w:shd w:val="clear" w:fill="FFFFFF"/>
+          <w:lang w:val="en-US" w:eastAsia="zh-CN"/>
+        </w:rPr>
+      </w:pPr>
       <w:r>
         <w:rPr>
           <w:rFonts w:hint="eastAsia" w:ascii="Segoe UI" w:hAnsi="Segoe UI" w:eastAsia="宋体" w:cs="Segoe UI"/>
@@ -1458,181 +1575,11 @@
           <w:spacing w:val="0"/>
           <w:sz w:val="21"/>
           <w:szCs w:val="21"/>
-          <w:shd w:val="clear" w:fill="FFFFFF"/>
-          <w:lang w:val="en-US" w:eastAsia="zh-CN"/>
-        </w:rPr>
-        <w:t>号</w:t>
-      </w:r>
-      <w:r>
-        <w:rPr>
-          <w:rFonts w:hint="default" w:ascii="Segoe UI" w:hAnsi="Segoe UI" w:eastAsia="Segoe UI" w:cs="Segoe UI"/>
-          <w:i w:val="0"/>
-          <w:iCs w:val="0"/>
-          <w:caps w:val="0"/>
-          <w:color w:val="000000"/>
-          <w:spacing w:val="0"/>
-          <w:sz w:val="21"/>
-          <w:szCs w:val="21"/>
-          <w:shd w:val="clear" w:fill="FFFFFF"/>
-        </w:rPr>
-        <w:t>开通</w:t>
-      </w:r>
-      <w:r>
-        <w:rPr>
-          <w:rFonts w:hint="eastAsia" w:ascii="Segoe UI" w:hAnsi="Segoe UI" w:eastAsia="宋体" w:cs="Segoe UI"/>
-          <w:i w:val="0"/>
-          <w:iCs w:val="0"/>
-          <w:caps w:val="0"/>
-          <w:color w:val="000000"/>
-          <w:spacing w:val="0"/>
-          <w:sz w:val="21"/>
-          <w:szCs w:val="21"/>
-          <w:shd w:val="clear" w:fill="FFFFFF"/>
-          <w:lang w:val="en-US" w:eastAsia="zh-CN"/>
-        </w:rPr>
-        <w:t>国际</w:t>
-      </w:r>
-      <w:r>
-        <w:rPr>
-          <w:rFonts w:hint="default" w:ascii="Segoe UI" w:hAnsi="Segoe UI" w:eastAsia="Segoe UI" w:cs="Segoe UI"/>
-          <w:i w:val="0"/>
-          <w:iCs w:val="0"/>
-          <w:caps w:val="0"/>
-          <w:color w:val="000000"/>
-          <w:spacing w:val="0"/>
-          <w:sz w:val="21"/>
-          <w:szCs w:val="21"/>
-          <w:shd w:val="clear" w:fill="FFFFFF"/>
-        </w:rPr>
-        <w:t>漫游</w:t>
-      </w:r>
-      <w:r>
-        <w:rPr>
-          <w:rFonts w:hint="eastAsia" w:ascii="Segoe UI" w:hAnsi="Segoe UI" w:eastAsia="宋体" w:cs="Segoe UI"/>
-          <w:i w:val="0"/>
-          <w:iCs w:val="0"/>
-          <w:caps w:val="0"/>
-          <w:color w:val="000000"/>
-          <w:spacing w:val="0"/>
-          <w:sz w:val="21"/>
-          <w:szCs w:val="21"/>
-          <w:shd w:val="clear" w:fill="FFFFFF"/>
-          <w:lang w:val="en-US" w:eastAsia="zh-CN"/>
-        </w:rPr>
-        <w:t>以接收短信</w:t>
-      </w:r>
-      <w:r>
-        <w:rPr>
-          <w:rFonts w:hint="default" w:ascii="Segoe UI" w:hAnsi="Segoe UI" w:eastAsia="Segoe UI" w:cs="Segoe UI"/>
-          <w:i w:val="0"/>
-          <w:iCs w:val="0"/>
-          <w:caps w:val="0"/>
-          <w:color w:val="000000"/>
-          <w:spacing w:val="0"/>
-          <w:sz w:val="21"/>
-          <w:szCs w:val="21"/>
-          <w:shd w:val="clear" w:fill="FFFFFF"/>
-        </w:rPr>
-        <w:t>、</w:t>
-      </w:r>
-      <w:r>
-        <w:rPr>
-          <w:rFonts w:hint="eastAsia" w:ascii="Segoe UI" w:hAnsi="Segoe UI" w:eastAsia="宋体" w:cs="Segoe UI"/>
-          <w:i w:val="0"/>
-          <w:iCs w:val="0"/>
-          <w:caps w:val="0"/>
-          <w:color w:val="000000"/>
-          <w:spacing w:val="0"/>
-          <w:sz w:val="21"/>
-          <w:szCs w:val="21"/>
-          <w:shd w:val="clear" w:fill="FFFFFF"/>
-          <w:lang w:val="en-US" w:eastAsia="zh-CN"/>
-        </w:rPr>
-        <w:t>连</w:t>
-      </w:r>
-      <w:r>
-        <w:rPr>
-          <w:rFonts w:hint="default" w:ascii="Segoe UI" w:hAnsi="Segoe UI" w:eastAsia="Segoe UI" w:cs="Segoe UI"/>
-          <w:i w:val="0"/>
-          <w:iCs w:val="0"/>
-          <w:caps w:val="0"/>
-          <w:color w:val="000000"/>
-          <w:spacing w:val="0"/>
-          <w:sz w:val="21"/>
-          <w:szCs w:val="21"/>
-          <w:shd w:val="clear" w:fill="FFFFFF"/>
-        </w:rPr>
-        <w:t>香港</w:t>
-      </w:r>
-      <w:r>
-        <w:rPr>
-          <w:rFonts w:hint="eastAsia" w:ascii="Segoe UI" w:hAnsi="Segoe UI" w:eastAsia="宋体" w:cs="Segoe UI"/>
-          <w:i w:val="0"/>
-          <w:iCs w:val="0"/>
-          <w:caps w:val="0"/>
-          <w:color w:val="000000"/>
-          <w:spacing w:val="0"/>
-          <w:sz w:val="21"/>
-          <w:szCs w:val="21"/>
-          <w:shd w:val="clear" w:fill="FFFFFF"/>
-          <w:lang w:val="en-US" w:eastAsia="zh-CN"/>
-        </w:rPr>
-        <w:t>wifi（商场或餐厅均可）</w:t>
-      </w:r>
-      <w:r>
-        <w:rPr>
-          <w:rFonts w:hint="default" w:ascii="Segoe UI" w:hAnsi="Segoe UI" w:eastAsia="Segoe UI" w:cs="Segoe UI"/>
-          <w:i w:val="0"/>
-          <w:iCs w:val="0"/>
-          <w:caps w:val="0"/>
-          <w:color w:val="000000"/>
-          <w:spacing w:val="0"/>
-          <w:sz w:val="21"/>
-          <w:szCs w:val="21"/>
-          <w:shd w:val="clear" w:fill="FFFFFF"/>
-        </w:rPr>
-        <w:t>、移民局 12367 出入境</w:t>
-      </w:r>
-      <w:r>
-        <w:rPr>
-          <w:rFonts w:hint="eastAsia" w:ascii="Segoe UI" w:hAnsi="Segoe UI" w:eastAsia="宋体" w:cs="Segoe UI"/>
-          <w:i w:val="0"/>
-          <w:iCs w:val="0"/>
-          <w:caps w:val="0"/>
-          <w:color w:val="000000"/>
-          <w:spacing w:val="0"/>
-          <w:sz w:val="21"/>
-          <w:szCs w:val="21"/>
-          <w:shd w:val="clear" w:fill="FFFFFF"/>
-          <w:lang w:val="en-US" w:eastAsia="zh-CN"/>
-        </w:rPr>
-        <w:t>微信小程序</w:t>
-      </w:r>
-      <w:r>
-        <w:rPr>
-          <w:rFonts w:hint="default" w:ascii="Segoe UI" w:hAnsi="Segoe UI" w:eastAsia="Segoe UI" w:cs="Segoe UI"/>
-          <w:i w:val="0"/>
-          <w:iCs w:val="0"/>
-          <w:caps w:val="0"/>
-          <w:color w:val="000000"/>
-          <w:spacing w:val="0"/>
-          <w:sz w:val="21"/>
-          <w:szCs w:val="21"/>
-          <w:shd w:val="clear" w:fill="FFFFFF"/>
-        </w:rPr>
-        <w:t>记录。</w:t>
-      </w:r>
-    </w:p>
-    <w:p>
-      <w:pPr>
-        <w:pStyle w:val="4"/>
-        <w:bidi w:val="0"/>
-      </w:pPr>
-      <w:r>
-        <w:rPr>
-          <w:rFonts w:hint="default"/>
-        </w:rPr>
-        <w:t>流程步骤</w:t>
+          <w:highlight w:val="yellow"/>
+          <w:shd w:val="clear" w:fill="FFFFFF"/>
+          <w:lang w:val="en-US" w:eastAsia="zh-CN"/>
+        </w:rPr>
+        <w:t>注意！！所有证件有效期均需大于一年！！</w:t>
       </w:r>
     </w:p>
     <w:p>
@@ -1654,21 +1601,208 @@
           <w:spacing w:val="0"/>
           <w:sz w:val="21"/>
           <w:szCs w:val="21"/>
-        </w:rPr>
-      </w:pPr>
-      <w:r>
-        <w:rPr>
-          <w:rFonts w:hint="default" w:ascii="Segoe UI" w:hAnsi="Segoe UI" w:eastAsia="Segoe UI" w:cs="Segoe UI"/>
-          <w:i w:val="0"/>
-          <w:iCs w:val="0"/>
-          <w:caps w:val="0"/>
-          <w:color w:val="000000"/>
-          <w:spacing w:val="0"/>
-          <w:sz w:val="21"/>
-          <w:szCs w:val="21"/>
-          <w:shd w:val="clear" w:fill="FFFFFF"/>
-        </w:rPr>
-        <w:t>打开 ZA Bank App,点击开户。</w:t>
+          <w:shd w:val="clear" w:fill="FFFFFF"/>
+        </w:rPr>
+      </w:pPr>
+      <w:r>
+        <w:rPr>
+          <w:rFonts w:hint="default" w:ascii="Segoe UI" w:hAnsi="Segoe UI" w:eastAsia="Segoe UI" w:cs="Segoe UI"/>
+          <w:i w:val="0"/>
+          <w:iCs w:val="0"/>
+          <w:caps w:val="0"/>
+          <w:color w:val="000000"/>
+          <w:spacing w:val="0"/>
+          <w:sz w:val="21"/>
+          <w:szCs w:val="21"/>
+          <w:shd w:val="clear" w:fill="FFFFFF"/>
+        </w:rPr>
+        <w:t>手机</w:t>
+      </w:r>
+      <w:r>
+        <w:rPr>
+          <w:rFonts w:hint="eastAsia" w:ascii="Segoe UI" w:hAnsi="Segoe UI" w:eastAsia="宋体" w:cs="Segoe UI"/>
+          <w:i w:val="0"/>
+          <w:iCs w:val="0"/>
+          <w:caps w:val="0"/>
+          <w:color w:val="000000"/>
+          <w:spacing w:val="0"/>
+          <w:sz w:val="21"/>
+          <w:szCs w:val="21"/>
+          <w:shd w:val="clear" w:fill="FFFFFF"/>
+          <w:lang w:val="en-US" w:eastAsia="zh-CN"/>
+        </w:rPr>
+        <w:t>号</w:t>
+      </w:r>
+      <w:r>
+        <w:rPr>
+          <w:rFonts w:hint="default" w:ascii="Segoe UI" w:hAnsi="Segoe UI" w:eastAsia="Segoe UI" w:cs="Segoe UI"/>
+          <w:i w:val="0"/>
+          <w:iCs w:val="0"/>
+          <w:caps w:val="0"/>
+          <w:color w:val="000000"/>
+          <w:spacing w:val="0"/>
+          <w:sz w:val="21"/>
+          <w:szCs w:val="21"/>
+          <w:shd w:val="clear" w:fill="FFFFFF"/>
+        </w:rPr>
+        <w:t>开通</w:t>
+      </w:r>
+      <w:r>
+        <w:rPr>
+          <w:rFonts w:hint="eastAsia" w:ascii="Segoe UI" w:hAnsi="Segoe UI" w:eastAsia="宋体" w:cs="Segoe UI"/>
+          <w:i w:val="0"/>
+          <w:iCs w:val="0"/>
+          <w:caps w:val="0"/>
+          <w:color w:val="000000"/>
+          <w:spacing w:val="0"/>
+          <w:sz w:val="21"/>
+          <w:szCs w:val="21"/>
+          <w:shd w:val="clear" w:fill="FFFFFF"/>
+          <w:lang w:val="en-US" w:eastAsia="zh-CN"/>
+        </w:rPr>
+        <w:t>国际</w:t>
+      </w:r>
+      <w:r>
+        <w:rPr>
+          <w:rFonts w:hint="default" w:ascii="Segoe UI" w:hAnsi="Segoe UI" w:eastAsia="Segoe UI" w:cs="Segoe UI"/>
+          <w:i w:val="0"/>
+          <w:iCs w:val="0"/>
+          <w:caps w:val="0"/>
+          <w:color w:val="000000"/>
+          <w:spacing w:val="0"/>
+          <w:sz w:val="21"/>
+          <w:szCs w:val="21"/>
+          <w:shd w:val="clear" w:fill="FFFFFF"/>
+        </w:rPr>
+        <w:t>漫游</w:t>
+      </w:r>
+      <w:r>
+        <w:rPr>
+          <w:rFonts w:hint="eastAsia" w:ascii="Segoe UI" w:hAnsi="Segoe UI" w:eastAsia="宋体" w:cs="Segoe UI"/>
+          <w:i w:val="0"/>
+          <w:iCs w:val="0"/>
+          <w:caps w:val="0"/>
+          <w:color w:val="000000"/>
+          <w:spacing w:val="0"/>
+          <w:sz w:val="21"/>
+          <w:szCs w:val="21"/>
+          <w:shd w:val="clear" w:fill="FFFFFF"/>
+          <w:lang w:val="en-US" w:eastAsia="zh-CN"/>
+        </w:rPr>
+        <w:t>以接收短信</w:t>
+      </w:r>
+      <w:r>
+        <w:rPr>
+          <w:rFonts w:hint="default" w:ascii="Segoe UI" w:hAnsi="Segoe UI" w:eastAsia="Segoe UI" w:cs="Segoe UI"/>
+          <w:i w:val="0"/>
+          <w:iCs w:val="0"/>
+          <w:caps w:val="0"/>
+          <w:color w:val="000000"/>
+          <w:spacing w:val="0"/>
+          <w:sz w:val="21"/>
+          <w:szCs w:val="21"/>
+          <w:shd w:val="clear" w:fill="FFFFFF"/>
+        </w:rPr>
+        <w:t>、</w:t>
+      </w:r>
+      <w:r>
+        <w:rPr>
+          <w:rFonts w:hint="eastAsia" w:ascii="Segoe UI" w:hAnsi="Segoe UI" w:eastAsia="宋体" w:cs="Segoe UI"/>
+          <w:i w:val="0"/>
+          <w:iCs w:val="0"/>
+          <w:caps w:val="0"/>
+          <w:color w:val="000000"/>
+          <w:spacing w:val="0"/>
+          <w:sz w:val="21"/>
+          <w:szCs w:val="21"/>
+          <w:shd w:val="clear" w:fill="FFFFFF"/>
+          <w:lang w:val="en-US" w:eastAsia="zh-CN"/>
+        </w:rPr>
+        <w:t>连</w:t>
+      </w:r>
+      <w:r>
+        <w:rPr>
+          <w:rFonts w:hint="default" w:ascii="Segoe UI" w:hAnsi="Segoe UI" w:eastAsia="Segoe UI" w:cs="Segoe UI"/>
+          <w:i w:val="0"/>
+          <w:iCs w:val="0"/>
+          <w:caps w:val="0"/>
+          <w:color w:val="000000"/>
+          <w:spacing w:val="0"/>
+          <w:sz w:val="21"/>
+          <w:szCs w:val="21"/>
+          <w:shd w:val="clear" w:fill="FFFFFF"/>
+        </w:rPr>
+        <w:t>香港</w:t>
+      </w:r>
+      <w:r>
+        <w:rPr>
+          <w:rFonts w:hint="eastAsia" w:ascii="Segoe UI" w:hAnsi="Segoe UI" w:eastAsia="宋体" w:cs="Segoe UI"/>
+          <w:i w:val="0"/>
+          <w:iCs w:val="0"/>
+          <w:caps w:val="0"/>
+          <w:color w:val="000000"/>
+          <w:spacing w:val="0"/>
+          <w:sz w:val="21"/>
+          <w:szCs w:val="21"/>
+          <w:shd w:val="clear" w:fill="FFFFFF"/>
+          <w:lang w:val="en-US" w:eastAsia="zh-CN"/>
+        </w:rPr>
+        <w:t>wifi（商场或餐厅均可）</w:t>
+      </w:r>
+      <w:r>
+        <w:rPr>
+          <w:rFonts w:hint="default" w:ascii="Segoe UI" w:hAnsi="Segoe UI" w:eastAsia="Segoe UI" w:cs="Segoe UI"/>
+          <w:i w:val="0"/>
+          <w:iCs w:val="0"/>
+          <w:caps w:val="0"/>
+          <w:color w:val="000000"/>
+          <w:spacing w:val="0"/>
+          <w:sz w:val="21"/>
+          <w:szCs w:val="21"/>
+          <w:shd w:val="clear" w:fill="FFFFFF"/>
+        </w:rPr>
+        <w:t>、移民局 12367 出入境</w:t>
+      </w:r>
+      <w:r>
+        <w:rPr>
+          <w:rFonts w:hint="eastAsia" w:ascii="Segoe UI" w:hAnsi="Segoe UI" w:eastAsia="宋体" w:cs="Segoe UI"/>
+          <w:i w:val="0"/>
+          <w:iCs w:val="0"/>
+          <w:caps w:val="0"/>
+          <w:color w:val="000000"/>
+          <w:spacing w:val="0"/>
+          <w:sz w:val="21"/>
+          <w:szCs w:val="21"/>
+          <w:shd w:val="clear" w:fill="FFFFFF"/>
+          <w:lang w:val="en-US" w:eastAsia="zh-CN"/>
+        </w:rPr>
+        <w:t>微信小程序</w:t>
+      </w:r>
+      <w:r>
+        <w:rPr>
+          <w:rFonts w:hint="default" w:ascii="Segoe UI" w:hAnsi="Segoe UI" w:eastAsia="Segoe UI" w:cs="Segoe UI"/>
+          <w:i w:val="0"/>
+          <w:iCs w:val="0"/>
+          <w:caps w:val="0"/>
+          <w:color w:val="000000"/>
+          <w:spacing w:val="0"/>
+          <w:sz w:val="21"/>
+          <w:szCs w:val="21"/>
+          <w:shd w:val="clear" w:fill="FFFFFF"/>
+        </w:rPr>
+        <w:t>记录。</w:t>
+      </w:r>
+    </w:p>
+    <w:p>
+      <w:pPr>
+        <w:pStyle w:val="4"/>
+        <w:bidi w:val="0"/>
+      </w:pPr>
+      <w:r>
+        <w:rPr>
+          <w:rFonts w:hint="default"/>
+        </w:rPr>
+        <w:t>流程步骤</w:t>
       </w:r>
     </w:p>
     <w:p>
@@ -1704,7 +1838,7 @@
           <w:szCs w:val="21"/>
           <w:shd w:val="clear" w:fill="FFFFFF"/>
         </w:rPr>
-        <w:t>绑定手机(没收到验证码可能是没开国际漫游!)</w:t>
+        <w:t>打开 ZA Bank App,点击开户。</w:t>
       </w:r>
     </w:p>
     <w:p>
@@ -1740,36 +1874,7 @@
           <w:szCs w:val="21"/>
           <w:shd w:val="clear" w:fill="FFFFFF"/>
         </w:rPr>
-        <w:t xml:space="preserve">填邀请码 [ </w:t>
-      </w:r>
-      <w:r>
-        <w:rPr>
-          <w:rFonts w:hint="eastAsia" w:ascii="Segoe UI" w:hAnsi="Segoe UI" w:eastAsia="宋体" w:cs="Segoe UI"/>
-          <w:i w:val="0"/>
-          <w:iCs w:val="0"/>
-          <w:caps w:val="0"/>
-          <w:color w:val="000000"/>
-          <w:spacing w:val="0"/>
-          <w:sz w:val="21"/>
-          <w:szCs w:val="21"/>
-          <w:shd w:val="clear" w:fill="FFFFFF"/>
-          <w:lang w:val="en-US" w:eastAsia="zh-CN"/>
-        </w:rPr>
-        <w:t>LN7258</w:t>
-      </w:r>
-      <w:r>
-        <w:rPr>
-          <w:rFonts w:hint="default" w:ascii="Segoe UI" w:hAnsi="Segoe UI" w:eastAsia="Segoe UI" w:cs="Segoe UI"/>
-          <w:i w:val="0"/>
-          <w:iCs w:val="0"/>
-          <w:caps w:val="0"/>
-          <w:color w:val="000000"/>
-          <w:spacing w:val="0"/>
-          <w:sz w:val="21"/>
-          <w:szCs w:val="21"/>
-          <w:shd w:val="clear" w:fill="FFFFFF"/>
-        </w:rPr>
-        <w:t xml:space="preserve"> ] ,选税务地“中国内地”。</w:t>
+        <w:t>绑定手机(没收到验证码可能是没开国际漫游!)</w:t>
       </w:r>
     </w:p>
     <w:p>
@@ -1805,7 +1910,36 @@
           <w:szCs w:val="21"/>
           <w:shd w:val="clear" w:fill="FFFFFF"/>
         </w:rPr>
-        <w:t>验证邮箱(qq 邮箱,网易 163,gmail, outlook 等都可)</w:t>
+        <w:t xml:space="preserve">填邀请码 [ </w:t>
+      </w:r>
+      <w:r>
+        <w:rPr>
+          <w:rFonts w:hint="eastAsia" w:ascii="Segoe UI" w:hAnsi="Segoe UI" w:eastAsia="宋体" w:cs="Segoe UI"/>
+          <w:i w:val="0"/>
+          <w:iCs w:val="0"/>
+          <w:caps w:val="0"/>
+          <w:color w:val="000000"/>
+          <w:spacing w:val="0"/>
+          <w:sz w:val="21"/>
+          <w:szCs w:val="21"/>
+          <w:shd w:val="clear" w:fill="FFFFFF"/>
+          <w:lang w:val="en-US" w:eastAsia="zh-CN"/>
+        </w:rPr>
+        <w:t>LN7258</w:t>
+      </w:r>
+      <w:r>
+        <w:rPr>
+          <w:rFonts w:hint="default" w:ascii="Segoe UI" w:hAnsi="Segoe UI" w:eastAsia="Segoe UI" w:cs="Segoe UI"/>
+          <w:i w:val="0"/>
+          <w:iCs w:val="0"/>
+          <w:caps w:val="0"/>
+          <w:color w:val="000000"/>
+          <w:spacing w:val="0"/>
+          <w:sz w:val="21"/>
+          <w:szCs w:val="21"/>
+          <w:shd w:val="clear" w:fill="FFFFFF"/>
+        </w:rPr>
+        <w:t xml:space="preserve"> ] ,选税务地“中国内地”。</w:t>
       </w:r>
     </w:p>
     <w:p>
@@ -1841,7 +1975,94 @@
           <w:szCs w:val="21"/>
           <w:shd w:val="clear" w:fill="FFFFFF"/>
         </w:rPr>
-        <w:t>拍身份证,人脸识别核验身份</w:t>
+        <w:t>验证邮箱(qq邮箱,网易163</w:t>
+      </w:r>
+      <w:r>
+        <w:rPr>
+          <w:rFonts w:hint="eastAsia" w:ascii="Segoe UI" w:hAnsi="Segoe UI" w:eastAsia="宋体" w:cs="Segoe UI"/>
+          <w:i w:val="0"/>
+          <w:iCs w:val="0"/>
+          <w:caps w:val="0"/>
+          <w:color w:val="000000"/>
+          <w:spacing w:val="0"/>
+          <w:sz w:val="21"/>
+          <w:szCs w:val="21"/>
+          <w:shd w:val="clear" w:fill="FFFFFF"/>
+          <w:lang w:val="en-US" w:eastAsia="zh-CN"/>
+        </w:rPr>
+        <w:t xml:space="preserve"> </w:t>
+      </w:r>
+      <w:r>
+        <w:rPr>
+          <w:rFonts w:hint="default" w:ascii="Segoe UI" w:hAnsi="Segoe UI" w:eastAsia="Segoe UI" w:cs="Segoe UI"/>
+          <w:i w:val="0"/>
+          <w:iCs w:val="0"/>
+          <w:caps w:val="0"/>
+          <w:color w:val="000000"/>
+          <w:spacing w:val="0"/>
+          <w:sz w:val="21"/>
+          <w:szCs w:val="21"/>
+          <w:shd w:val="clear" w:fill="FFFFFF"/>
+        </w:rPr>
+        <w:t>,</w:t>
+      </w:r>
+      <w:r>
+        <w:rPr>
+          <w:rFonts w:hint="eastAsia" w:ascii="Segoe UI" w:hAnsi="Segoe UI" w:eastAsia="宋体" w:cs="Segoe UI"/>
+          <w:i w:val="0"/>
+          <w:iCs w:val="0"/>
+          <w:caps w:val="0"/>
+          <w:color w:val="000000"/>
+          <w:spacing w:val="0"/>
+          <w:sz w:val="21"/>
+          <w:szCs w:val="21"/>
+          <w:shd w:val="clear" w:fill="FFFFFF"/>
+          <w:lang w:val="en-US" w:eastAsia="zh-CN"/>
+        </w:rPr>
+        <w:t xml:space="preserve"> </w:t>
+      </w:r>
+      <w:r>
+        <w:rPr>
+          <w:rFonts w:hint="default" w:ascii="Segoe UI" w:hAnsi="Segoe UI" w:eastAsia="Segoe UI" w:cs="Segoe UI"/>
+          <w:i w:val="0"/>
+          <w:iCs w:val="0"/>
+          <w:caps w:val="0"/>
+          <w:color w:val="000000"/>
+          <w:spacing w:val="0"/>
+          <w:sz w:val="21"/>
+          <w:szCs w:val="21"/>
+          <w:shd w:val="clear" w:fill="FFFFFF"/>
+        </w:rPr>
+        <w:t>gmail</w:t>
+      </w:r>
+      <w:r>
+        <w:rPr>
+          <w:rFonts w:hint="eastAsia" w:ascii="Segoe UI" w:hAnsi="Segoe UI" w:eastAsia="宋体" w:cs="Segoe UI"/>
+          <w:i w:val="0"/>
+          <w:iCs w:val="0"/>
+          <w:caps w:val="0"/>
+          <w:color w:val="000000"/>
+          <w:spacing w:val="0"/>
+          <w:sz w:val="21"/>
+          <w:szCs w:val="21"/>
+          <w:shd w:val="clear" w:fill="FFFFFF"/>
+          <w:lang w:val="en-US" w:eastAsia="zh-CN"/>
+        </w:rPr>
+        <w:t xml:space="preserve"> </w:t>
+      </w:r>
+      <w:r>
+        <w:rPr>
+          <w:rFonts w:hint="default" w:ascii="Segoe UI" w:hAnsi="Segoe UI" w:eastAsia="Segoe UI" w:cs="Segoe UI"/>
+          <w:i w:val="0"/>
+          <w:iCs w:val="0"/>
+          <w:caps w:val="0"/>
+          <w:color w:val="000000"/>
+          <w:spacing w:val="0"/>
+          <w:sz w:val="21"/>
+          <w:szCs w:val="21"/>
+          <w:shd w:val="clear" w:fill="FFFFFF"/>
+        </w:rPr>
+        <w:t>, outlook 等都可)</w:t>
       </w:r>
     </w:p>
     <w:p>
@@ -1877,65 +2098,7 @@
           <w:szCs w:val="21"/>
           <w:shd w:val="clear" w:fill="FFFFFF"/>
         </w:rPr>
-        <w:t>填写通讯地址,填</w:t>
-      </w:r>
-      <w:r>
-        <w:rPr>
-          <w:rFonts w:hint="eastAsia" w:ascii="Segoe UI" w:hAnsi="Segoe UI" w:eastAsia="宋体" w:cs="Segoe UI"/>
-          <w:i w:val="0"/>
-          <w:iCs w:val="0"/>
-          <w:caps w:val="0"/>
-          <w:color w:val="000000"/>
-          <w:spacing w:val="0"/>
-          <w:sz w:val="21"/>
-          <w:szCs w:val="21"/>
-          <w:shd w:val="clear" w:fill="FFFFFF"/>
-          <w:lang w:val="en-US" w:eastAsia="zh-CN"/>
-        </w:rPr>
-        <w:t>身份证</w:t>
-      </w:r>
-      <w:r>
-        <w:rPr>
-          <w:rFonts w:hint="default" w:ascii="Segoe UI" w:hAnsi="Segoe UI" w:eastAsia="Segoe UI" w:cs="Segoe UI"/>
-          <w:i w:val="0"/>
-          <w:iCs w:val="0"/>
-          <w:caps w:val="0"/>
-          <w:color w:val="000000"/>
-          <w:spacing w:val="0"/>
-          <w:sz w:val="21"/>
-          <w:szCs w:val="21"/>
-          <w:shd w:val="clear" w:fill="FFFFFF"/>
-        </w:rPr>
-        <w:t>地址</w:t>
-      </w:r>
-      <w:r>
-        <w:rPr>
-          <w:rFonts w:hint="eastAsia" w:ascii="Segoe UI" w:hAnsi="Segoe UI" w:eastAsia="宋体" w:cs="Segoe UI"/>
-          <w:i w:val="0"/>
-          <w:iCs w:val="0"/>
-          <w:caps w:val="0"/>
-          <w:color w:val="000000"/>
-          <w:spacing w:val="0"/>
-          <w:sz w:val="21"/>
-          <w:szCs w:val="21"/>
-          <w:shd w:val="clear" w:fill="FFFFFF"/>
-          <w:lang w:val="en-US" w:eastAsia="zh-CN"/>
-        </w:rPr>
-        <w:t>或目前居住地址</w:t>
-      </w:r>
-      <w:r>
-        <w:rPr>
-          <w:rFonts w:hint="default" w:ascii="Segoe UI" w:hAnsi="Segoe UI" w:eastAsia="Segoe UI" w:cs="Segoe UI"/>
-          <w:i w:val="0"/>
-          <w:iCs w:val="0"/>
-          <w:caps w:val="0"/>
-          <w:color w:val="000000"/>
-          <w:spacing w:val="0"/>
-          <w:sz w:val="21"/>
-          <w:szCs w:val="21"/>
-          <w:shd w:val="clear" w:fill="FFFFFF"/>
-        </w:rPr>
-        <w:t>即可</w:t>
+        <w:t>拍身份证,人脸识别核验身份</w:t>
       </w:r>
     </w:p>
     <w:p>
@@ -1971,7 +2134,7 @@
           <w:szCs w:val="21"/>
           <w:shd w:val="clear" w:fill="FFFFFF"/>
         </w:rPr>
-        <w:t xml:space="preserve">填 </w:t>
+        <w:t>填写通讯地址,填</w:t>
       </w:r>
       <w:r>
         <w:rPr>
@@ -1986,21 +2149,50 @@
           <w:shd w:val="clear" w:fill="FFFFFF"/>
           <w:lang w:val="en-US" w:eastAsia="zh-CN"/>
         </w:rPr>
-        <w:t>税</w:t>
-      </w:r>
-      <w:r>
-        <w:rPr>
-          <w:rFonts w:hint="default" w:ascii="Segoe UI" w:hAnsi="Segoe UI" w:eastAsia="Segoe UI" w:cs="Segoe UI"/>
-          <w:i w:val="0"/>
-          <w:iCs w:val="0"/>
-          <w:caps w:val="0"/>
-          <w:color w:val="000000"/>
-          <w:spacing w:val="0"/>
-          <w:sz w:val="21"/>
-          <w:szCs w:val="21"/>
-          <w:shd w:val="clear" w:fill="FFFFFF"/>
-        </w:rPr>
-        <w:t>务(身份证号),职业信息(薪资参考 2 万港币/月档,学生可填自</w:t>
+        <w:t>身份证</w:t>
+      </w:r>
+      <w:r>
+        <w:rPr>
+          <w:rFonts w:hint="default" w:ascii="Segoe UI" w:hAnsi="Segoe UI" w:eastAsia="Segoe UI" w:cs="Segoe UI"/>
+          <w:i w:val="0"/>
+          <w:iCs w:val="0"/>
+          <w:caps w:val="0"/>
+          <w:color w:val="000000"/>
+          <w:spacing w:val="0"/>
+          <w:sz w:val="21"/>
+          <w:szCs w:val="21"/>
+          <w:shd w:val="clear" w:fill="FFFFFF"/>
+        </w:rPr>
+        <w:t>地址</w:t>
+      </w:r>
+      <w:r>
+        <w:rPr>
+          <w:rFonts w:hint="eastAsia" w:ascii="Segoe UI" w:hAnsi="Segoe UI" w:eastAsia="宋体" w:cs="Segoe UI"/>
+          <w:i w:val="0"/>
+          <w:iCs w:val="0"/>
+          <w:caps w:val="0"/>
+          <w:color w:val="000000"/>
+          <w:spacing w:val="0"/>
+          <w:sz w:val="21"/>
+          <w:szCs w:val="21"/>
+          <w:shd w:val="clear" w:fill="FFFFFF"/>
+          <w:lang w:val="en-US" w:eastAsia="zh-CN"/>
+        </w:rPr>
+        <w:t>或目前居住地址</w:t>
+      </w:r>
+      <w:r>
+        <w:rPr>
+          <w:rFonts w:hint="default" w:ascii="Segoe UI" w:hAnsi="Segoe UI" w:eastAsia="Segoe UI" w:cs="Segoe UI"/>
+          <w:i w:val="0"/>
+          <w:iCs w:val="0"/>
+          <w:caps w:val="0"/>
+          <w:color w:val="000000"/>
+          <w:spacing w:val="0"/>
+          <w:sz w:val="21"/>
+          <w:szCs w:val="21"/>
+          <w:shd w:val="clear" w:fill="FFFFFF"/>
+        </w:rPr>
+        <w:t>即可</w:t>
       </w:r>
     </w:p>
     <w:p>
@@ -2036,7 +2228,65 @@
           <w:szCs w:val="21"/>
           <w:shd w:val="clear" w:fill="FFFFFF"/>
         </w:rPr>
-        <w:t>由职业),开户目的选 [储蓄] 会好一些</w:t>
+        <w:t xml:space="preserve">填 </w:t>
+      </w:r>
+      <w:r>
+        <w:rPr>
+          <w:rFonts w:hint="eastAsia" w:ascii="Segoe UI" w:hAnsi="Segoe UI" w:eastAsia="宋体" w:cs="Segoe UI"/>
+          <w:i w:val="0"/>
+          <w:iCs w:val="0"/>
+          <w:caps w:val="0"/>
+          <w:color w:val="000000"/>
+          <w:spacing w:val="0"/>
+          <w:sz w:val="21"/>
+          <w:szCs w:val="21"/>
+          <w:shd w:val="clear" w:fill="FFFFFF"/>
+          <w:lang w:val="en-US" w:eastAsia="zh-CN"/>
+        </w:rPr>
+        <w:t>税</w:t>
+      </w:r>
+      <w:r>
+        <w:rPr>
+          <w:rFonts w:hint="default" w:ascii="Segoe UI" w:hAnsi="Segoe UI" w:eastAsia="Segoe UI" w:cs="Segoe UI"/>
+          <w:i w:val="0"/>
+          <w:iCs w:val="0"/>
+          <w:caps w:val="0"/>
+          <w:color w:val="000000"/>
+          <w:spacing w:val="0"/>
+          <w:sz w:val="21"/>
+          <w:szCs w:val="21"/>
+          <w:shd w:val="clear" w:fill="FFFFFF"/>
+        </w:rPr>
+        <w:t>务(身份证号),职业信息(薪资参考 2 万港币/月档,学生可填</w:t>
+      </w:r>
+      <w:r>
+        <w:rPr>
+          <w:rFonts w:hint="eastAsia" w:ascii="Segoe UI" w:hAnsi="Segoe UI" w:eastAsia="宋体" w:cs="Segoe UI"/>
+          <w:i w:val="0"/>
+          <w:iCs w:val="0"/>
+          <w:caps w:val="0"/>
+          <w:color w:val="000000"/>
+          <w:spacing w:val="0"/>
+          <w:sz w:val="21"/>
+          <w:szCs w:val="21"/>
+          <w:shd w:val="clear" w:fill="FFFFFF"/>
+          <w:lang w:val="en-US" w:eastAsia="zh-CN"/>
+        </w:rPr>
+        <w:t>学生、</w:t>
+      </w:r>
+      <w:r>
+        <w:rPr>
+          <w:rFonts w:hint="default" w:ascii="Segoe UI" w:hAnsi="Segoe UI" w:eastAsia="Segoe UI" w:cs="Segoe UI"/>
+          <w:i w:val="0"/>
+          <w:iCs w:val="0"/>
+          <w:caps w:val="0"/>
+          <w:color w:val="000000"/>
+          <w:spacing w:val="0"/>
+          <w:sz w:val="21"/>
+          <w:szCs w:val="21"/>
+          <w:shd w:val="clear" w:fill="FFFFFF"/>
+        </w:rPr>
+        <w:t>自</w:t>
       </w:r>
     </w:p>
     <w:p>
@@ -2072,7 +2322,7 @@
           <w:szCs w:val="21"/>
           <w:shd w:val="clear" w:fill="FFFFFF"/>
         </w:rPr>
-        <w:t>设用户名密码并记录(最好截个图)</w:t>
+        <w:t>由职业),开户目的选 [储蓄] 会好一些</w:t>
       </w:r>
     </w:p>
     <w:p>
@@ -2098,61 +2348,17 @@
       </w:pPr>
       <w:r>
         <w:rPr>
-          <w:rFonts w:hint="eastAsia" w:ascii="Segoe UI" w:hAnsi="Segoe UI" w:eastAsia="宋体" w:cs="Segoe UI"/>
-          <w:i w:val="0"/>
-          <w:iCs w:val="0"/>
-          <w:caps w:val="0"/>
-          <w:color w:val="000000"/>
-          <w:spacing w:val="0"/>
-          <w:sz w:val="21"/>
-          <w:szCs w:val="21"/>
-          <w:shd w:val="clear" w:fill="FFFFFF"/>
-          <w:lang w:val="en-US" w:eastAsia="zh-CN"/>
-        </w:rPr>
-        <w:t>填</w:t>
-      </w:r>
-      <w:r>
-        <w:rPr>
-          <w:rFonts w:hint="default" w:ascii="Segoe UI" w:hAnsi="Segoe UI" w:eastAsia="Segoe UI" w:cs="Segoe UI"/>
-          <w:i w:val="0"/>
-          <w:iCs w:val="0"/>
-          <w:caps w:val="0"/>
-          <w:color w:val="000000"/>
-          <w:spacing w:val="0"/>
-          <w:sz w:val="21"/>
-          <w:szCs w:val="21"/>
-          <w:shd w:val="clear" w:fill="FFFFFF"/>
-        </w:rPr>
-        <w:t>内地</w:t>
-      </w:r>
-      <w:r>
-        <w:rPr>
-          <w:rFonts w:hint="eastAsia" w:ascii="Segoe UI" w:hAnsi="Segoe UI" w:eastAsia="宋体" w:cs="Segoe UI"/>
-          <w:i w:val="0"/>
-          <w:iCs w:val="0"/>
-          <w:caps w:val="0"/>
-          <w:color w:val="000000"/>
-          <w:spacing w:val="0"/>
-          <w:sz w:val="21"/>
-          <w:szCs w:val="21"/>
-          <w:shd w:val="clear" w:fill="FFFFFF"/>
-          <w:lang w:val="en-US" w:eastAsia="zh-CN"/>
-        </w:rPr>
-        <w:t>银行卡号码</w:t>
-      </w:r>
-      <w:r>
-        <w:rPr>
-          <w:rFonts w:hint="default" w:ascii="Segoe UI" w:hAnsi="Segoe UI" w:eastAsia="Segoe UI" w:cs="Segoe UI"/>
-          <w:i w:val="0"/>
-          <w:iCs w:val="0"/>
-          <w:caps w:val="0"/>
-          <w:color w:val="000000"/>
-          <w:spacing w:val="0"/>
-          <w:sz w:val="21"/>
-          <w:szCs w:val="21"/>
-          <w:shd w:val="clear" w:fill="FFFFFF"/>
-        </w:rPr>
-        <w:t>并上传移民局出入境记录(vx 或 zfb 搜“移民局小程序 12367 下</w:t>
+          <w:rFonts w:hint="default" w:ascii="Segoe UI" w:hAnsi="Segoe UI" w:eastAsia="Segoe UI" w:cs="Segoe UI"/>
+          <w:i w:val="0"/>
+          <w:iCs w:val="0"/>
+          <w:caps w:val="0"/>
+          <w:color w:val="000000"/>
+          <w:spacing w:val="0"/>
+          <w:sz w:val="21"/>
+          <w:szCs w:val="21"/>
+          <w:shd w:val="clear" w:fill="FFFFFF"/>
+        </w:rPr>
+        <w:t>设用户名密码并记录(最好截个图)</w:t>
       </w:r>
     </w:p>
     <w:p>
@@ -2174,22 +2380,65 @@
           <w:spacing w:val="0"/>
           <w:sz w:val="21"/>
           <w:szCs w:val="21"/>
-          <w:shd w:val="clear" w:fill="FFFFFF"/>
-        </w:rPr>
-      </w:pPr>
-      <w:r>
-        <w:rPr>
-          <w:rFonts w:hint="default" w:ascii="Segoe UI" w:hAnsi="Segoe UI" w:eastAsia="Segoe UI" w:cs="Segoe UI"/>
-          <w:i w:val="0"/>
-          <w:iCs w:val="0"/>
-          <w:caps w:val="0"/>
-          <w:color w:val="000000"/>
-          <w:spacing w:val="0"/>
-          <w:sz w:val="21"/>
-          <w:szCs w:val="21"/>
-          <w:shd w:val="clear" w:fill="FFFFFF"/>
-        </w:rPr>
-        <w:t>载文件)</w:t>
+        </w:rPr>
+      </w:pPr>
+      <w:r>
+        <w:rPr>
+          <w:rFonts w:hint="eastAsia" w:ascii="Segoe UI" w:hAnsi="Segoe UI" w:eastAsia="宋体" w:cs="Segoe UI"/>
+          <w:i w:val="0"/>
+          <w:iCs w:val="0"/>
+          <w:caps w:val="0"/>
+          <w:color w:val="000000"/>
+          <w:spacing w:val="0"/>
+          <w:sz w:val="21"/>
+          <w:szCs w:val="21"/>
+          <w:shd w:val="clear" w:fill="FFFFFF"/>
+          <w:lang w:val="en-US" w:eastAsia="zh-CN"/>
+        </w:rPr>
+        <w:t>填</w:t>
+      </w:r>
+      <w:r>
+        <w:rPr>
+          <w:rFonts w:hint="default" w:ascii="Segoe UI" w:hAnsi="Segoe UI" w:eastAsia="Segoe UI" w:cs="Segoe UI"/>
+          <w:i w:val="0"/>
+          <w:iCs w:val="0"/>
+          <w:caps w:val="0"/>
+          <w:color w:val="000000"/>
+          <w:spacing w:val="0"/>
+          <w:sz w:val="21"/>
+          <w:szCs w:val="21"/>
+          <w:shd w:val="clear" w:fill="FFFFFF"/>
+        </w:rPr>
+        <w:t>内地</w:t>
+      </w:r>
+      <w:r>
+        <w:rPr>
+          <w:rFonts w:hint="eastAsia" w:ascii="Segoe UI" w:hAnsi="Segoe UI" w:eastAsia="宋体" w:cs="Segoe UI"/>
+          <w:i w:val="0"/>
+          <w:iCs w:val="0"/>
+          <w:caps w:val="0"/>
+          <w:color w:val="000000"/>
+          <w:spacing w:val="0"/>
+          <w:sz w:val="21"/>
+          <w:szCs w:val="21"/>
+          <w:shd w:val="clear" w:fill="FFFFFF"/>
+          <w:lang w:val="en-US" w:eastAsia="zh-CN"/>
+        </w:rPr>
+        <w:t>银行卡号码</w:t>
+      </w:r>
+      <w:r>
+        <w:rPr>
+          <w:rFonts w:hint="default" w:ascii="Segoe UI" w:hAnsi="Segoe UI" w:eastAsia="Segoe UI" w:cs="Segoe UI"/>
+          <w:i w:val="0"/>
+          <w:iCs w:val="0"/>
+          <w:caps w:val="0"/>
+          <w:color w:val="000000"/>
+          <w:spacing w:val="0"/>
+          <w:sz w:val="21"/>
+          <w:szCs w:val="21"/>
+          <w:shd w:val="clear" w:fill="FFFFFF"/>
+        </w:rPr>
+        <w:t>并上传移民局出入境记录(vx 或 zfb 搜“移民局小程序 12367 下</w:t>
       </w:r>
     </w:p>
     <w:p>
@@ -2224,39 +2473,9 @@
           <w:spacing w:val="0"/>
           <w:sz w:val="21"/>
           <w:szCs w:val="21"/>
-          <w:highlight w:val="yellow"/>
-          <w:shd w:val="clear" w:fill="FFFFFF"/>
-        </w:rPr>
-        <w:t>务必勾选开通股票和基金服务功能</w:t>
-      </w:r>
-      <w:r>
-        <w:rPr>
-          <w:rFonts w:hint="default" w:ascii="Segoe UI" w:hAnsi="Segoe UI" w:eastAsia="Segoe UI" w:cs="Segoe UI"/>
-          <w:i w:val="0"/>
-          <w:iCs w:val="0"/>
-          <w:caps w:val="0"/>
-          <w:color w:val="000000"/>
-          <w:spacing w:val="0"/>
-          <w:sz w:val="21"/>
-          <w:szCs w:val="21"/>
-          <w:shd w:val="clear" w:fill="FFFFFF"/>
-        </w:rPr>
-        <w:t>,提交审核(大约一个工作日审核完）</w:t>
-      </w:r>
-    </w:p>
-    <w:p>
-      <w:pPr>
-        <w:pStyle w:val="5"/>
-        <w:bidi w:val="0"/>
-        <w:rPr>
-          <w:rFonts w:hint="default"/>
-        </w:rPr>
-      </w:pPr>
-      <w:r>
-        <w:rPr>
-          <w:rFonts w:hint="default"/>
-        </w:rPr>
-        <w:t>!!!! 返现要求</w:t>
+          <w:shd w:val="clear" w:fill="FFFFFF"/>
+        </w:rPr>
+        <w:t>载文件)</w:t>
       </w:r>
     </w:p>
     <w:p>
@@ -2270,29 +2489,60 @@
         <w:ind w:left="0" w:firstLine="0"/>
         <w:jc w:val="left"/>
         <w:rPr>
-          <w:rFonts w:ascii="Segoe UI" w:hAnsi="Segoe UI" w:eastAsia="Segoe UI" w:cs="Segoe UI"/>
-          <w:i w:val="0"/>
-          <w:iCs w:val="0"/>
-          <w:caps w:val="0"/>
-          <w:color w:val="000000"/>
-          <w:spacing w:val="0"/>
-          <w:sz w:val="21"/>
-          <w:szCs w:val="21"/>
-        </w:rPr>
-      </w:pPr>
-      <w:r>
-        <w:rPr>
-          <w:rFonts w:hint="default" w:ascii="Segoe UI" w:hAnsi="Segoe UI" w:eastAsia="Segoe UI" w:cs="Segoe UI"/>
-          <w:i w:val="0"/>
-          <w:iCs w:val="0"/>
-          <w:caps w:val="0"/>
-          <w:color w:val="000000"/>
-          <w:spacing w:val="0"/>
-          <w:sz w:val="21"/>
-          <w:szCs w:val="21"/>
-          <w:shd w:val="clear" w:fill="FFFFFF"/>
-        </w:rPr>
-        <w:t>完成开户后，在 14 天内 确保账户满足以下任一条件（只需满足其中一个条件）</w:t>
+          <w:rFonts w:hint="default" w:ascii="Segoe UI" w:hAnsi="Segoe UI" w:eastAsia="Segoe UI" w:cs="Segoe UI"/>
+          <w:i w:val="0"/>
+          <w:iCs w:val="0"/>
+          <w:caps w:val="0"/>
+          <w:color w:val="000000"/>
+          <w:spacing w:val="0"/>
+          <w:sz w:val="21"/>
+          <w:szCs w:val="21"/>
+          <w:shd w:val="clear" w:fill="FFFFFF"/>
+        </w:rPr>
+      </w:pPr>
+      <w:r>
+        <w:rPr>
+          <w:rFonts w:hint="default" w:ascii="Segoe UI" w:hAnsi="Segoe UI" w:eastAsia="Segoe UI" w:cs="Segoe UI"/>
+          <w:i w:val="0"/>
+          <w:iCs w:val="0"/>
+          <w:caps w:val="0"/>
+          <w:color w:val="000000"/>
+          <w:spacing w:val="0"/>
+          <w:sz w:val="21"/>
+          <w:szCs w:val="21"/>
+          <w:highlight w:val="yellow"/>
+          <w:shd w:val="clear" w:fill="FFFFFF"/>
+        </w:rPr>
+        <w:t>务必勾选开通股票和基金服务功能</w:t>
+      </w:r>
+      <w:r>
+        <w:rPr>
+          <w:rFonts w:hint="default" w:ascii="Segoe UI" w:hAnsi="Segoe UI" w:eastAsia="Segoe UI" w:cs="Segoe UI"/>
+          <w:i w:val="0"/>
+          <w:iCs w:val="0"/>
+          <w:caps w:val="0"/>
+          <w:color w:val="000000"/>
+          <w:spacing w:val="0"/>
+          <w:sz w:val="21"/>
+          <w:szCs w:val="21"/>
+          <w:shd w:val="clear" w:fill="FFFFFF"/>
+        </w:rPr>
+        <w:t>,提交审核(大约一个工作日审核完）</w:t>
+      </w:r>
+    </w:p>
+    <w:p>
+      <w:pPr>
+        <w:pStyle w:val="5"/>
+        <w:bidi w:val="0"/>
+        <w:rPr>
+          <w:rFonts w:hint="default"/>
+        </w:rPr>
+      </w:pPr>
+      <w:r>
+        <w:rPr>
+          <w:rFonts w:hint="default"/>
+        </w:rPr>
+        <w:t>!!!! 返现要求</w:t>
       </w:r>
     </w:p>
     <w:p>
@@ -2306,29 +2556,29 @@
         <w:ind w:left="0" w:firstLine="0"/>
         <w:jc w:val="left"/>
         <w:rPr>
-          <w:rFonts w:hint="default" w:ascii="Segoe UI" w:hAnsi="Segoe UI" w:eastAsia="Segoe UI" w:cs="Segoe UI"/>
-          <w:i w:val="0"/>
-          <w:iCs w:val="0"/>
-          <w:caps w:val="0"/>
-          <w:color w:val="000000"/>
-          <w:spacing w:val="0"/>
-          <w:sz w:val="21"/>
-          <w:szCs w:val="21"/>
-        </w:rPr>
-      </w:pPr>
-      <w:r>
-        <w:rPr>
-          <w:rFonts w:hint="default" w:ascii="Segoe UI" w:hAnsi="Segoe UI" w:eastAsia="Segoe UI" w:cs="Segoe UI"/>
-          <w:i w:val="0"/>
-          <w:iCs w:val="0"/>
-          <w:caps w:val="0"/>
-          <w:color w:val="000000"/>
-          <w:spacing w:val="0"/>
-          <w:sz w:val="21"/>
-          <w:szCs w:val="21"/>
-          <w:shd w:val="clear" w:fill="FFFFFF"/>
-        </w:rPr>
-        <w:t>存款： 日终存款余额≥HKD 200,000 或其等值; 或</w:t>
+          <w:rFonts w:ascii="Segoe UI" w:hAnsi="Segoe UI" w:eastAsia="Segoe UI" w:cs="Segoe UI"/>
+          <w:i w:val="0"/>
+          <w:iCs w:val="0"/>
+          <w:caps w:val="0"/>
+          <w:color w:val="000000"/>
+          <w:spacing w:val="0"/>
+          <w:sz w:val="21"/>
+          <w:szCs w:val="21"/>
+        </w:rPr>
+      </w:pPr>
+      <w:r>
+        <w:rPr>
+          <w:rFonts w:hint="default" w:ascii="Segoe UI" w:hAnsi="Segoe UI" w:eastAsia="Segoe UI" w:cs="Segoe UI"/>
+          <w:i w:val="0"/>
+          <w:iCs w:val="0"/>
+          <w:caps w:val="0"/>
+          <w:color w:val="000000"/>
+          <w:spacing w:val="0"/>
+          <w:sz w:val="21"/>
+          <w:szCs w:val="21"/>
+          <w:shd w:val="clear" w:fill="FFFFFF"/>
+        </w:rPr>
+        <w:t>完成开户后，在 14 天内 确保账户满足以下任一条件（只需满足其中一个条件）</w:t>
       </w:r>
     </w:p>
     <w:p>
@@ -2364,7 +2614,7 @@
           <w:szCs w:val="21"/>
           <w:shd w:val="clear" w:fill="FFFFFF"/>
         </w:rPr>
-        <w:t>基金： 日终基金总资产≥HKD 100,000 或其等值; 或</w:t>
+        <w:t>存款： 日终存款余额≥HKD 200,000 或其等值; 或</w:t>
       </w:r>
     </w:p>
     <w:p>
@@ -2378,23 +2628,29 @@
         <w:ind w:left="0" w:firstLine="0"/>
         <w:jc w:val="left"/>
         <w:rPr>
-          <w:highlight w:val="yellow"/>
-        </w:rPr>
-      </w:pPr>
-      <w:r>
-        <w:rPr>
-          <w:rFonts w:hint="default" w:ascii="Segoe UI" w:hAnsi="Segoe UI" w:eastAsia="Segoe UI" w:cs="Segoe UI"/>
-          <w:i w:val="0"/>
-          <w:iCs w:val="0"/>
-          <w:caps w:val="0"/>
-          <w:color w:val="000000"/>
-          <w:spacing w:val="0"/>
-          <w:sz w:val="21"/>
-          <w:szCs w:val="21"/>
-          <w:highlight w:val="yellow"/>
-          <w:shd w:val="clear" w:fill="FFFFFF"/>
-        </w:rPr>
-        <w:t>股票： 日终股票总资产≥HKD 10,000 或其等值;(这个最容易完成，买一万股票放一个交易日过夜即可）</w:t>
+          <w:rFonts w:hint="default" w:ascii="Segoe UI" w:hAnsi="Segoe UI" w:eastAsia="Segoe UI" w:cs="Segoe UI"/>
+          <w:i w:val="0"/>
+          <w:iCs w:val="0"/>
+          <w:caps w:val="0"/>
+          <w:color w:val="000000"/>
+          <w:spacing w:val="0"/>
+          <w:sz w:val="21"/>
+          <w:szCs w:val="21"/>
+        </w:rPr>
+      </w:pPr>
+      <w:r>
+        <w:rPr>
+          <w:rFonts w:hint="default" w:ascii="Segoe UI" w:hAnsi="Segoe UI" w:eastAsia="Segoe UI" w:cs="Segoe UI"/>
+          <w:i w:val="0"/>
+          <w:iCs w:val="0"/>
+          <w:caps w:val="0"/>
+          <w:color w:val="000000"/>
+          <w:spacing w:val="0"/>
+          <w:sz w:val="21"/>
+          <w:szCs w:val="21"/>
+          <w:shd w:val="clear" w:fill="FFFFFF"/>
+        </w:rPr>
+        <w:t>基金： 日终基金总资产≥HKD 100,000 或其等值; 或</w:t>
       </w:r>
     </w:p>
     <w:p>
@@ -2408,29 +2664,23 @@
         <w:ind w:left="0" w:firstLine="0"/>
         <w:jc w:val="left"/>
         <w:rPr>
-          <w:rFonts w:ascii="Segoe UI" w:hAnsi="Segoe UI" w:eastAsia="Segoe UI" w:cs="Segoe UI"/>
-          <w:i w:val="0"/>
-          <w:iCs w:val="0"/>
-          <w:caps w:val="0"/>
-          <w:color w:val="000000"/>
-          <w:spacing w:val="0"/>
-          <w:sz w:val="21"/>
-          <w:szCs w:val="21"/>
-        </w:rPr>
-      </w:pPr>
-      <w:r>
-        <w:rPr>
-          <w:rFonts w:hint="default" w:ascii="Segoe UI" w:hAnsi="Segoe UI" w:eastAsia="Segoe UI" w:cs="Segoe UI"/>
-          <w:i w:val="0"/>
-          <w:iCs w:val="0"/>
-          <w:caps w:val="0"/>
-          <w:color w:val="000000"/>
-          <w:spacing w:val="0"/>
-          <w:sz w:val="21"/>
-          <w:szCs w:val="21"/>
-          <w:shd w:val="clear" w:fill="FFFFFF"/>
-        </w:rPr>
-        <w:t>返现机制： 达成以上任一条件后:，系统将在次日晚上 21:00 前处理。核对无误后，我将直接通过 ZA Bank 转账，或按</w:t>
+          <w:highlight w:val="yellow"/>
+        </w:rPr>
+      </w:pPr>
+      <w:r>
+        <w:rPr>
+          <w:rFonts w:hint="default" w:ascii="Segoe UI" w:hAnsi="Segoe UI" w:eastAsia="Segoe UI" w:cs="Segoe UI"/>
+          <w:i w:val="0"/>
+          <w:iCs w:val="0"/>
+          <w:caps w:val="0"/>
+          <w:color w:val="000000"/>
+          <w:spacing w:val="0"/>
+          <w:sz w:val="21"/>
+          <w:szCs w:val="21"/>
+          <w:highlight w:val="yellow"/>
+          <w:shd w:val="clear" w:fill="FFFFFF"/>
+        </w:rPr>
+        <w:t>股票： 日终股票总资产≥HKD 10,000 或其等值;(这个最容易完成，买一万股票</w:t>
       </w:r>
       <w:r>
         <w:rPr>
@@ -2442,27 +2692,27 @@
           <w:spacing w:val="0"/>
           <w:sz w:val="21"/>
           <w:szCs w:val="21"/>
-          <w:shd w:val="clear" w:fill="FFFFFF"/>
-          <w:lang w:val="en-US" w:eastAsia="zh-CN"/>
-        </w:rPr>
-        <w:t>ZA Bank</w:t>
-      </w:r>
-      <w:r>
-        <w:rPr>
-          <w:rFonts w:hint="default" w:ascii="Segoe UI" w:hAnsi="Segoe UI" w:eastAsia="Segoe UI" w:cs="Segoe UI"/>
-          <w:i w:val="0"/>
-          <w:iCs w:val="0"/>
-          <w:caps w:val="0"/>
-          <w:color w:val="000000"/>
-          <w:spacing w:val="0"/>
-          <w:sz w:val="21"/>
-          <w:szCs w:val="21"/>
-          <w:shd w:val="clear" w:fill="FFFFFF"/>
-        </w:rPr>
-        <w:t xml:space="preserve">实时汇率通过微信/支付宝返还你 300 HKD </w:t>
-      </w:r>
-      <w:bookmarkStart w:id="0" w:name="_GoBack"/>
-      <w:bookmarkEnd w:id="0"/>
+          <w:highlight w:val="yellow"/>
+          <w:shd w:val="clear" w:fill="FFFFFF"/>
+          <w:lang w:val="en-US" w:eastAsia="zh-CN"/>
+        </w:rPr>
+        <w:t>(等值港股或美股)</w:t>
+      </w:r>
+      <w:r>
+        <w:rPr>
+          <w:rFonts w:hint="default" w:ascii="Segoe UI" w:hAnsi="Segoe UI" w:eastAsia="Segoe UI" w:cs="Segoe UI"/>
+          <w:i w:val="0"/>
+          <w:iCs w:val="0"/>
+          <w:caps w:val="0"/>
+          <w:color w:val="000000"/>
+          <w:spacing w:val="0"/>
+          <w:sz w:val="21"/>
+          <w:szCs w:val="21"/>
+          <w:highlight w:val="yellow"/>
+          <w:shd w:val="clear" w:fill="FFFFFF"/>
+        </w:rPr>
+        <w:t>放一个交易日过夜即可）</w:t>
+      </w:r>
     </w:p>
     <w:p>
       <w:pPr>
@@ -2475,29 +2725,212 @@
         <w:ind w:left="0" w:firstLine="0"/>
         <w:jc w:val="left"/>
         <w:rPr>
-          <w:rFonts w:hint="default" w:ascii="Segoe UI" w:hAnsi="Segoe UI" w:eastAsia="Segoe UI" w:cs="Segoe UI"/>
-          <w:i w:val="0"/>
-          <w:iCs w:val="0"/>
-          <w:caps w:val="0"/>
-          <w:color w:val="000000"/>
-          <w:spacing w:val="0"/>
-          <w:sz w:val="21"/>
-          <w:szCs w:val="21"/>
-        </w:rPr>
-      </w:pPr>
-      <w:r>
-        <w:rPr>
-          <w:rFonts w:hint="default" w:ascii="Segoe UI" w:hAnsi="Segoe UI" w:eastAsia="Segoe UI" w:cs="Segoe UI"/>
-          <w:i w:val="0"/>
-          <w:iCs w:val="0"/>
-          <w:caps w:val="0"/>
-          <w:color w:val="000000"/>
-          <w:spacing w:val="0"/>
-          <w:sz w:val="21"/>
-          <w:szCs w:val="21"/>
-          <w:shd w:val="clear" w:fill="FFFFFF"/>
-        </w:rPr>
-        <w:t>另外，被邀请人维持此条件累计达 7 天(无需连续): 日终股票总资产≥HKD10.000 或其等值; 或日终基金总资产 HKD100.000 或其等值;或日终存款余额≥HKD200,000 或其等值（只需满足其中一个条件）即可前往 ZA Quest7 领取 1 张 USD30 美光科技(MU) 指定美股兑换券</w:t>
+          <w:rFonts w:ascii="Segoe UI" w:hAnsi="Segoe UI" w:eastAsia="Segoe UI" w:cs="Segoe UI"/>
+          <w:i w:val="0"/>
+          <w:iCs w:val="0"/>
+          <w:caps w:val="0"/>
+          <w:color w:val="000000"/>
+          <w:spacing w:val="0"/>
+          <w:sz w:val="21"/>
+          <w:szCs w:val="21"/>
+        </w:rPr>
+      </w:pPr>
+      <w:r>
+        <w:rPr>
+          <w:rFonts w:hint="default" w:ascii="Segoe UI" w:hAnsi="Segoe UI" w:eastAsia="Segoe UI" w:cs="Segoe UI"/>
+          <w:i w:val="0"/>
+          <w:iCs w:val="0"/>
+          <w:caps w:val="0"/>
+          <w:color w:val="000000"/>
+          <w:spacing w:val="0"/>
+          <w:sz w:val="21"/>
+          <w:szCs w:val="21"/>
+          <w:shd w:val="clear" w:fill="FFFFFF"/>
+        </w:rPr>
+        <w:t>返现机制： 达成以上任一条件后:，系统将在次日晚上 21:00 前处理。核对无误后，我将直接通过 ZA Bank 转账300 HKD，或按</w:t>
+      </w:r>
+      <w:r>
+        <w:rPr>
+          <w:rFonts w:hint="eastAsia" w:ascii="Segoe UI" w:hAnsi="Segoe UI" w:eastAsia="宋体" w:cs="Segoe UI"/>
+          <w:i w:val="0"/>
+          <w:iCs w:val="0"/>
+          <w:caps w:val="0"/>
+          <w:color w:val="000000"/>
+          <w:spacing w:val="0"/>
+          <w:sz w:val="21"/>
+          <w:szCs w:val="21"/>
+          <w:shd w:val="clear" w:fill="FFFFFF"/>
+          <w:lang w:val="en-US" w:eastAsia="zh-CN"/>
+        </w:rPr>
+        <w:t>ZA Bank</w:t>
+      </w:r>
+      <w:r>
+        <w:rPr>
+          <w:rFonts w:hint="default" w:ascii="Segoe UI" w:hAnsi="Segoe UI" w:eastAsia="Segoe UI" w:cs="Segoe UI"/>
+          <w:i w:val="0"/>
+          <w:iCs w:val="0"/>
+          <w:caps w:val="0"/>
+          <w:color w:val="000000"/>
+          <w:spacing w:val="0"/>
+          <w:sz w:val="21"/>
+          <w:szCs w:val="21"/>
+          <w:shd w:val="clear" w:fill="FFFFFF"/>
+        </w:rPr>
+        <w:t>实时汇率通过微信/支付宝返还你</w:t>
+      </w:r>
+      <w:r>
+        <w:rPr>
+          <w:rFonts w:hint="eastAsia" w:ascii="Segoe UI" w:hAnsi="Segoe UI" w:eastAsia="宋体" w:cs="Segoe UI"/>
+          <w:i w:val="0"/>
+          <w:iCs w:val="0"/>
+          <w:caps w:val="0"/>
+          <w:color w:val="000000"/>
+          <w:spacing w:val="0"/>
+          <w:sz w:val="21"/>
+          <w:szCs w:val="21"/>
+          <w:shd w:val="clear" w:fill="FFFFFF"/>
+          <w:lang w:val="en-US" w:eastAsia="zh-CN"/>
+        </w:rPr>
+        <w:t>等值RMB</w:t>
+      </w:r>
+      <w:r>
+        <w:rPr>
+          <w:rFonts w:hint="default" w:ascii="Segoe UI" w:hAnsi="Segoe UI" w:eastAsia="Segoe UI" w:cs="Segoe UI"/>
+          <w:i w:val="0"/>
+          <w:iCs w:val="0"/>
+          <w:caps w:val="0"/>
+          <w:color w:val="000000"/>
+          <w:spacing w:val="0"/>
+          <w:sz w:val="21"/>
+          <w:szCs w:val="21"/>
+          <w:shd w:val="clear" w:fill="FFFFFF"/>
+        </w:rPr>
+        <w:t xml:space="preserve">  </w:t>
+      </w:r>
+    </w:p>
+    <w:p>
+      <w:pPr>
+        <w:pStyle w:val="6"/>
+        <w:keepNext w:val="0"/>
+        <w:keepLines w:val="0"/>
+        <w:widowControl/>
+        <w:suppressLineNumbers w:val="0"/>
+        <w:shd w:val="clear" w:fill="FFFFFF"/>
+        <w:ind w:left="0" w:firstLine="0"/>
+        <w:jc w:val="left"/>
+        <w:rPr>
+          <w:rFonts w:hint="default" w:ascii="Segoe UI" w:hAnsi="Segoe UI" w:eastAsia="宋体" w:cs="Segoe UI"/>
+          <w:i w:val="0"/>
+          <w:iCs w:val="0"/>
+          <w:caps w:val="0"/>
+          <w:color w:val="000000"/>
+          <w:spacing w:val="0"/>
+          <w:sz w:val="21"/>
+          <w:szCs w:val="21"/>
+          <w:lang w:val="en-US" w:eastAsia="zh-CN"/>
+        </w:rPr>
+      </w:pPr>
+      <w:r>
+        <w:rPr>
+          <w:rFonts w:hint="default" w:ascii="Segoe UI" w:hAnsi="Segoe UI" w:eastAsia="Segoe UI" w:cs="Segoe UI"/>
+          <w:i w:val="0"/>
+          <w:iCs w:val="0"/>
+          <w:caps w:val="0"/>
+          <w:color w:val="000000"/>
+          <w:spacing w:val="0"/>
+          <w:sz w:val="21"/>
+          <w:szCs w:val="21"/>
+          <w:shd w:val="clear" w:fill="FFFFFF"/>
+        </w:rPr>
+        <w:t>另外，被邀请人维持此条件累计达 7 天(无需连续): 日终股票总资产≥HKD10</w:t>
+      </w:r>
+      <w:r>
+        <w:rPr>
+          <w:rFonts w:hint="eastAsia" w:ascii="Segoe UI" w:hAnsi="Segoe UI" w:eastAsia="宋体" w:cs="Segoe UI"/>
+          <w:i w:val="0"/>
+          <w:iCs w:val="0"/>
+          <w:caps w:val="0"/>
+          <w:color w:val="000000"/>
+          <w:spacing w:val="0"/>
+          <w:sz w:val="21"/>
+          <w:szCs w:val="21"/>
+          <w:shd w:val="clear" w:fill="FFFFFF"/>
+          <w:lang w:val="en-US" w:eastAsia="zh-CN"/>
+        </w:rPr>
+        <w:t>,</w:t>
+      </w:r>
+      <w:r>
+        <w:rPr>
+          <w:rFonts w:hint="default" w:ascii="Segoe UI" w:hAnsi="Segoe UI" w:eastAsia="Segoe UI" w:cs="Segoe UI"/>
+          <w:i w:val="0"/>
+          <w:iCs w:val="0"/>
+          <w:caps w:val="0"/>
+          <w:color w:val="000000"/>
+          <w:spacing w:val="0"/>
+          <w:sz w:val="21"/>
+          <w:szCs w:val="21"/>
+          <w:shd w:val="clear" w:fill="FFFFFF"/>
+        </w:rPr>
+        <w:t>000 或其等值; 或日终基金总资产 HKD100</w:t>
+      </w:r>
+      <w:r>
+        <w:rPr>
+          <w:rFonts w:hint="eastAsia" w:ascii="Segoe UI" w:hAnsi="Segoe UI" w:eastAsia="宋体" w:cs="Segoe UI"/>
+          <w:i w:val="0"/>
+          <w:iCs w:val="0"/>
+          <w:caps w:val="0"/>
+          <w:color w:val="000000"/>
+          <w:spacing w:val="0"/>
+          <w:sz w:val="21"/>
+          <w:szCs w:val="21"/>
+          <w:shd w:val="clear" w:fill="FFFFFF"/>
+          <w:lang w:val="en-US" w:eastAsia="zh-CN"/>
+        </w:rPr>
+        <w:t>,</w:t>
+      </w:r>
+      <w:r>
+        <w:rPr>
+          <w:rFonts w:hint="default" w:ascii="Segoe UI" w:hAnsi="Segoe UI" w:eastAsia="Segoe UI" w:cs="Segoe UI"/>
+          <w:i w:val="0"/>
+          <w:iCs w:val="0"/>
+          <w:caps w:val="0"/>
+          <w:color w:val="000000"/>
+          <w:spacing w:val="0"/>
+          <w:sz w:val="21"/>
+          <w:szCs w:val="21"/>
+          <w:shd w:val="clear" w:fill="FFFFFF"/>
+        </w:rPr>
+        <w:t>000 或其等值;或日终存款余额≥HKD200,000 或其等值（只需满足其中一个条件）即可前往 ZA Quest7 领取 1 张 USD30 美光科技(MU) 指定美股兑换券</w:t>
+      </w:r>
+      <w:r>
+        <w:rPr>
+          <w:rFonts w:hint="eastAsia" w:ascii="Segoe UI" w:hAnsi="Segoe UI" w:eastAsia="宋体" w:cs="Segoe UI"/>
+          <w:i w:val="0"/>
+          <w:iCs w:val="0"/>
+          <w:caps w:val="0"/>
+          <w:color w:val="000000"/>
+          <w:spacing w:val="0"/>
+          <w:sz w:val="21"/>
+          <w:szCs w:val="21"/>
+          <w:shd w:val="clear" w:fill="FFFFFF"/>
+          <w:lang w:eastAsia="zh-CN"/>
+        </w:rPr>
+        <w:t>。</w:t>
+      </w:r>
+      <w:r>
+        <w:rPr>
+          <w:rFonts w:hint="eastAsia" w:ascii="Segoe UI" w:hAnsi="Segoe UI" w:eastAsia="宋体" w:cs="Segoe UI"/>
+          <w:i w:val="0"/>
+          <w:iCs w:val="0"/>
+          <w:caps w:val="0"/>
+          <w:color w:val="000000"/>
+          <w:spacing w:val="0"/>
+          <w:sz w:val="21"/>
+          <w:szCs w:val="21"/>
+          <w:shd w:val="clear" w:fill="FFFFFF"/>
+          <w:lang w:val="en-US" w:eastAsia="zh-CN"/>
+        </w:rPr>
+        <w:t>还有1,000HKD的股票返现卷可以使用。</w:t>
       </w:r>
     </w:p>
     <w:p>
@@ -2702,13 +3135,13 @@
     <w:lsdException w:unhideWhenUsed="0" w:uiPriority="0" w:semiHidden="0" w:name="Body Text Indent 3"/>
     <w:lsdException w:unhideWhenUsed="0" w:uiPriority="0" w:semiHidden="0" w:name="Block Text"/>
     <w:lsdException w:qFormat="1" w:unhideWhenUsed="0" w:uiPriority="0" w:semiHidden="0" w:name="Hyperlink"/>
-    <w:lsdException w:unhideWhenUsed="0" w:uiPriority="0" w:semiHidden="0" w:name="FollowedHyperlink"/>
+    <w:lsdException w:qFormat="1" w:unhideWhenUsed="0" w:uiPriority="0" w:semiHidden="0" w:name="FollowedHyperlink"/>
     <w:lsdException w:qFormat="1" w:unhideWhenUsed="0" w:uiPriority="0" w:semiHidden="0" w:name="Strong"/>
     <w:lsdException w:qFormat="1" w:unhideWhenUsed="0" w:uiPriority="0" w:semiHidden="0" w:name="Emphasis"/>
     <w:lsdException w:unhideWhenUsed="0" w:uiPriority="0" w:semiHidden="0" w:name="Document Map"/>
     <w:lsdException w:unhideWhenUsed="0" w:uiPriority="0" w:semiHidden="0" w:name="Plain Text"/>
     <w:lsdException w:unhideWhenUsed="0" w:uiPriority="0" w:semiHidden="0" w:name="E-mail Signature"/>
-    <w:lsdException w:unhideWhenUsed="0" w:uiPriority="0" w:semiHidden="0" w:name="Normal (Web)"/>
+    <w:lsdException w:qFormat="1" w:unhideWhenUsed="0" w:uiPriority="0" w:semiHidden="0" w:name="Normal (Web)"/>
     <w:lsdException w:unhideWhenUsed="0" w:uiPriority="0" w:semiHidden="0" w:name="HTML Acronym"/>
     <w:lsdException w:unhideWhenUsed="0" w:uiPriority="0" w:semiHidden="0" w:name="HTML Address"/>
     <w:lsdException w:unhideWhenUsed="0" w:uiPriority="0" w:semiHidden="0" w:name="HTML Cite"/>
@@ -2978,6 +3411,7 @@
   <w:style w:type="paragraph" w:styleId="6">
     <w:name w:val="Normal (Web)"/>
     <w:basedOn w:val="1"/>
+    <w:qFormat/>
     <w:uiPriority w:val="0"/>
     <w:pPr>
       <w:spacing w:before="0" w:beforeAutospacing="1" w:after="0" w:afterAutospacing="1"/>
@@ -2993,6 +3427,7 @@
   <w:style w:type="character" w:styleId="9">
     <w:name w:val="FollowedHyperlink"/>
     <w:basedOn w:val="8"/>
+    <w:qFormat/>
     <w:uiPriority w:val="0"/>
     <w:rPr>
       <w:color w:val="800080"/>

</xml_diff>